<commit_message>
Update site after IYAP internship ended Oct 2026
- IYAP role: date to July–October 2026, past tense, confirm built PostgreSQL/Django DB across 75+ orgs
- About: flip IYAP sentence to past tense
- Projects: replace Bithiah's data system blurb with APU student org goal
- Resumes: replace both .docx files with latest versions

Co-Authored-By: Claude Sonnet 4.6 <noreply@anthropic.com>
</commit_message>
<xml_diff>
--- a/public/files/Pitzil-Avila-Castellanos-Resume.docx
+++ b/public/files/Pitzil-Avila-Castellanos-Resume.docx
@@ -465,61 +465,61 @@
           <w:sz w:val="20"/>
           <w:szCs w:val="20"/>
         </w:rPr>
-        <w:t xml:space="preserve">  |  July 2026 – Present</w:t>
-      </w:r>
-    </w:p>
-    <w:p>
-      <w:pPr>
-        <w:pStyle w:val="ListParagraph"/>
-        <w:numPr>
-          <w:ilvl w:val="0"/>
-          <w:numId w:val="2"/>
-        </w:numPr>
-        <w:spacing w:after="10" w:line="230"/>
-      </w:pPr>
-      <w:r>
-        <w:rPr>
-          <w:rFonts w:ascii="Calibri" w:cs="Calibri" w:eastAsia="Calibri" w:hAnsi="Calibri"/>
-          <w:sz w:val="19"/>
-          <w:szCs w:val="19"/>
-        </w:rPr>
-        <w:t xml:space="preserve">Conducting stakeholder mapping and discovery interviews with NGO partners across South Asia and Africa; designing a PostgreSQL/Django database to centralize partnership data for 75+ global organizations across 3 tiers</w:t>
-      </w:r>
-    </w:p>
-    <w:p>
-      <w:pPr>
-        <w:pStyle w:val="ListParagraph"/>
-        <w:numPr>
-          <w:ilvl w:val="0"/>
-          <w:numId w:val="2"/>
-        </w:numPr>
-        <w:spacing w:after="10" w:line="230"/>
-      </w:pPr>
-      <w:r>
-        <w:rPr>
-          <w:rFonts w:ascii="Calibri" w:cs="Calibri" w:eastAsia="Calibri" w:hAnsi="Calibri"/>
-          <w:sz w:val="19"/>
-          <w:szCs w:val="19"/>
-        </w:rPr>
-        <w:t xml:space="preserve">Producing stakeholder briefings, a published blog on education equity, and professional communications for an organization with volunteers across 6+ countries</w:t>
-      </w:r>
-    </w:p>
-    <w:p>
-      <w:pPr>
-        <w:pStyle w:val="ListParagraph"/>
-        <w:numPr>
-          <w:ilvl w:val="0"/>
-          <w:numId w:val="2"/>
-        </w:numPr>
-        <w:spacing w:after="10" w:line="230"/>
-      </w:pPr>
-      <w:r>
-        <w:rPr>
-          <w:rFonts w:ascii="Calibri" w:cs="Calibri" w:eastAsia="Calibri" w:hAnsi="Calibri"/>
-          <w:sz w:val="19"/>
-          <w:szCs w:val="19"/>
-        </w:rPr>
-        <w:t xml:space="preserve">Using Claude and Gemini to accelerate drafting and synthesis of stakeholder documentation and database design notes, independently validating all outputs against IYAP's actual data and partnership structure</w:t>
+        <w:t xml:space="preserve">  |  July 2026 – October 2026</w:t>
+      </w:r>
+    </w:p>
+    <w:p>
+      <w:pPr>
+        <w:pStyle w:val="ListParagraph"/>
+        <w:numPr>
+          <w:ilvl w:val="0"/>
+          <w:numId w:val="2"/>
+        </w:numPr>
+        <w:spacing w:after="10" w:line="230"/>
+      </w:pPr>
+      <w:r>
+        <w:rPr>
+          <w:rFonts w:ascii="Calibri" w:cs="Calibri" w:eastAsia="Calibri" w:hAnsi="Calibri"/>
+          <w:sz w:val="19"/>
+          <w:szCs w:val="19"/>
+        </w:rPr>
+        <w:t xml:space="preserve">Conducted stakeholder mapping and discovery interviews with NGO partners across South Asia and Africa; designed a PostgreSQL/Django database to centralize partnership data for 75+ global organizations across 3 tiers</w:t>
+      </w:r>
+    </w:p>
+    <w:p>
+      <w:pPr>
+        <w:pStyle w:val="ListParagraph"/>
+        <w:numPr>
+          <w:ilvl w:val="0"/>
+          <w:numId w:val="2"/>
+        </w:numPr>
+        <w:spacing w:after="10" w:line="230"/>
+      </w:pPr>
+      <w:r>
+        <w:rPr>
+          <w:rFonts w:ascii="Calibri" w:cs="Calibri" w:eastAsia="Calibri" w:hAnsi="Calibri"/>
+          <w:sz w:val="19"/>
+          <w:szCs w:val="19"/>
+        </w:rPr>
+        <w:t xml:space="preserve">Produced stakeholder briefings, a published blog on education equity, and professional communications for an organization with volunteers across 6+ countries</w:t>
+      </w:r>
+    </w:p>
+    <w:p>
+      <w:pPr>
+        <w:pStyle w:val="ListParagraph"/>
+        <w:numPr>
+          <w:ilvl w:val="0"/>
+          <w:numId w:val="2"/>
+        </w:numPr>
+        <w:spacing w:after="10" w:line="230"/>
+      </w:pPr>
+      <w:r>
+        <w:rPr>
+          <w:rFonts w:ascii="Calibri" w:cs="Calibri" w:eastAsia="Calibri" w:hAnsi="Calibri"/>
+          <w:sz w:val="19"/>
+          <w:szCs w:val="19"/>
+        </w:rPr>
+        <w:t xml:space="preserve">Used Claude and Gemini to accelerate drafting and synthesis of stakeholder documentation and database design notes, independently validated all outputs against IYAP's actual data and partnership structure</w:t>
       </w:r>
     </w:p>
     <w:p>
@@ -840,7 +840,22 @@
           <w:sz w:val="19"/>
           <w:szCs w:val="19"/>
         </w:rPr>
-        <w:t xml:space="preserve">Languages &amp; Tools: Python, Java, PostgreSQL, MySQL, HTML, Django, Bash, React, Git, Linux, Jamf Pro</w:t>
+        <w:t xml:space="preserve">Languages: Python, JavaScript, Java, C, HTML, CSS  |  Databases: PostgreSQL, MySQL</w:t>
+      </w:r>
+    </w:p>
+    <w:p>
+      <w:pPr>
+        <w:spacing w:after="20"/>
+      </w:pPr>
+      <w:r>
+        <w:rPr>
+          <w:rFonts w:ascii="Calibri" w:cs="Calibri" w:eastAsia="Calibri" w:hAnsi="Calibri"/>
+          <w:b w:val="false"/>
+          <w:bCs w:val="false"/>
+          <w:sz w:val="19"/>
+          <w:szCs w:val="19"/>
+        </w:rPr>
+        <w:t xml:space="preserve">Frameworks &amp; Tools: Django, REST APIs, React, Git, Bash, Linux, Jamf Pro</w:t>
       </w:r>
     </w:p>
     <w:p>

</xml_diff>

<commit_message>
Update resume downloads with latest versions (Oct 2026)
Co-Authored-By: Claude Sonnet 4.6 <noreply@anthropic.com>
</commit_message>
<xml_diff>
--- a/public/files/Pitzil-Avila-Castellanos-Resume.docx
+++ b/public/files/Pitzil-Avila-Castellanos-Resume.docx
@@ -681,43 +681,61 @@
           <w:sz w:val="19"/>
           <w:szCs w:val="19"/>
         </w:rPr>
-        <w:t xml:space="preserve">Developed a Python-based automated audit system that ingests and analyzes endpoint data across 700+ macOS devices, surfacing compliance patterns against university naming conventions</w:t>
-      </w:r>
-    </w:p>
-    <w:p>
-      <w:pPr>
-        <w:pStyle w:val="ListParagraph"/>
-        <w:numPr>
-          <w:ilvl w:val="0"/>
-          <w:numId w:val="2"/>
-        </w:numPr>
-        <w:spacing w:after="10" w:line="230"/>
-      </w:pPr>
-      <w:r>
-        <w:rPr>
-          <w:rFonts w:ascii="Calibri" w:cs="Calibri" w:eastAsia="Calibri" w:hAnsi="Calibri"/>
-          <w:sz w:val="19"/>
-          <w:szCs w:val="19"/>
-        </w:rPr>
-        <w:t xml:space="preserve">Standardized Mobile Device Management (MDM) workflows in Jamf Pro to streamline campus-wide technology deployments and reduce manual overhead</w:t>
-      </w:r>
-    </w:p>
-    <w:p>
-      <w:pPr>
-        <w:pStyle w:val="ListParagraph"/>
-        <w:numPr>
-          <w:ilvl w:val="0"/>
-          <w:numId w:val="2"/>
-        </w:numPr>
-        <w:spacing w:after="10" w:line="230"/>
-      </w:pPr>
-      <w:r>
-        <w:rPr>
-          <w:rFonts w:ascii="Calibri" w:cs="Calibri" w:eastAsia="Calibri" w:hAnsi="Calibri"/>
-          <w:sz w:val="19"/>
-          <w:szCs w:val="19"/>
-        </w:rPr>
-        <w:t xml:space="preserve">Using Claude to accelerate development of the audit system's Python logic, independently testing and validating all AI-assisted code against university compliance requirements before deployment</w:t>
+        <w:t xml:space="preserve">Built a CSV-driven Python tool querying the Jamf Pro API to diagnose 802.1X Wi-Fi profile failures, replacing manual checks</w:t>
+      </w:r>
+    </w:p>
+    <w:p>
+      <w:pPr>
+        <w:pStyle w:val="ListParagraph"/>
+        <w:numPr>
+          <w:ilvl w:val="0"/>
+          <w:numId w:val="2"/>
+        </w:numPr>
+        <w:spacing w:after="10" w:line="230"/>
+      </w:pPr>
+      <w:r>
+        <w:rPr>
+          <w:rFonts w:ascii="Calibri" w:cs="Calibri" w:eastAsia="Calibri" w:hAnsi="Calibri"/>
+          <w:sz w:val="19"/>
+          <w:szCs w:val="19"/>
+        </w:rPr>
+        <w:t xml:space="preserve">Built a Python pipeline that queries the Jamf Pro REST API nightly to audit 700+ macOS endpoints, detecting naming drift and stale inventory records that downstream security analytics depend on</w:t>
+      </w:r>
+    </w:p>
+    <w:p>
+      <w:pPr>
+        <w:pStyle w:val="ListParagraph"/>
+        <w:numPr>
+          <w:ilvl w:val="0"/>
+          <w:numId w:val="2"/>
+        </w:numPr>
+        <w:spacing w:after="10" w:line="230"/>
+      </w:pPr>
+      <w:r>
+        <w:rPr>
+          <w:rFonts w:ascii="Calibri" w:cs="Calibri" w:eastAsia="Calibri" w:hAnsi="Calibri"/>
+          <w:sz w:val="19"/>
+          <w:szCs w:val="19"/>
+        </w:rPr>
+        <w:t xml:space="preserve">Corrected 200+ mismatched device records with an algorithmic matching pipeline, giving security a clean source of truth</w:t>
+      </w:r>
+    </w:p>
+    <w:p>
+      <w:pPr>
+        <w:pStyle w:val="ListParagraph"/>
+        <w:numPr>
+          <w:ilvl w:val="0"/>
+          <w:numId w:val="2"/>
+        </w:numPr>
+        <w:spacing w:after="10" w:line="230"/>
+      </w:pPr>
+      <w:r>
+        <w:rPr>
+          <w:rFonts w:ascii="Calibri" w:cs="Calibri" w:eastAsia="Calibri" w:hAnsi="Calibri"/>
+          <w:sz w:val="19"/>
+          <w:szCs w:val="19"/>
+        </w:rPr>
+        <w:t xml:space="preserve">Automated deployment, configuration, session management, and removal of GoTo, Dialpad, Rave Engage, and other macOS apps fleet-wide via Jamf Pro and shell scripting, eliminating manual installs and persistent session data on shared devices</w:t>
       </w:r>
     </w:p>
     <w:p>

</xml_diff>

<commit_message>
Update humanitarian resume download
Co-Authored-By: Claude Sonnet 4.6 <noreply@anthropic.com>
</commit_message>
<xml_diff>
--- a/public/files/Pitzil-Avila-Castellanos-Resume.docx
+++ b/public/files/Pitzil-Avila-Castellanos-Resume.docx
@@ -4,7 +4,7 @@
   <w:body>
     <w:p>
       <w:pPr>
-        <w:spacing w:after="20"/>
+        <w:spacing w:after="10"/>
       </w:pPr>
       <w:r>
         <w:rPr>
@@ -19,7 +19,7 @@
     </w:p>
     <w:p>
       <w:pPr>
-        <w:spacing w:after="80"/>
+        <w:spacing w:after="40"/>
       </w:pPr>
       <w:r>
         <w:rPr>
@@ -32,7 +32,7 @@
     </w:p>
     <w:p>
       <w:pPr>
-        <w:spacing w:after="100"/>
+        <w:spacing w:after="50"/>
       </w:pPr>
       <w:r>
         <w:rPr>
@@ -50,7 +50,7 @@
         <w:pBdr>
           <w:bottom w:val="single" w:color="999999" w:sz="4" w:space="1"/>
         </w:pBdr>
-        <w:spacing w:after="25" w:before="50"/>
+        <w:spacing w:after="12" w:before="25"/>
       </w:pPr>
       <w:r>
         <w:rPr>
@@ -92,7 +92,7 @@
     </w:p>
     <w:p>
       <w:pPr>
-        <w:spacing w:after="0" w:before="40"/>
+        <w:spacing w:after="0" w:before="20"/>
       </w:pPr>
       <w:r>
         <w:rPr>
@@ -124,7 +124,7 @@
           <w:ilvl w:val="0"/>
           <w:numId w:val="2"/>
         </w:numPr>
-        <w:spacing w:after="10" w:line="230"/>
+        <w:spacing w:after="5" w:line="230"/>
       </w:pPr>
       <w:r>
         <w:rPr>
@@ -142,7 +142,7 @@
           <w:ilvl w:val="0"/>
           <w:numId w:val="2"/>
         </w:numPr>
-        <w:spacing w:after="10" w:line="230"/>
+        <w:spacing w:after="5" w:line="230"/>
       </w:pPr>
       <w:r>
         <w:rPr>
@@ -160,7 +160,7 @@
           <w:ilvl w:val="0"/>
           <w:numId w:val="2"/>
         </w:numPr>
-        <w:spacing w:after="10" w:line="230"/>
+        <w:spacing w:after="5" w:line="230"/>
       </w:pPr>
       <w:r>
         <w:rPr>
@@ -178,7 +178,7 @@
           <w:ilvl w:val="0"/>
           <w:numId w:val="2"/>
         </w:numPr>
-        <w:spacing w:after="10" w:line="230"/>
+        <w:spacing w:after="5" w:line="230"/>
       </w:pPr>
       <w:r>
         <w:rPr>
@@ -194,7 +194,7 @@
         <w:pBdr>
           <w:bottom w:val="single" w:color="999999" w:sz="4" w:space="1"/>
         </w:pBdr>
-        <w:spacing w:after="25" w:before="50"/>
+        <w:spacing w:after="12" w:before="25"/>
       </w:pPr>
       <w:r>
         <w:rPr>
@@ -209,7 +209,7 @@
     </w:p>
     <w:p>
       <w:pPr>
-        <w:spacing w:after="0" w:before="40"/>
+        <w:spacing w:after="0" w:before="20"/>
       </w:pPr>
       <w:r>
         <w:rPr>
@@ -236,7 +236,7 @@
     </w:p>
     <w:p>
       <w:pPr>
-        <w:spacing w:after="0" w:before="40"/>
+        <w:spacing w:after="0" w:before="20"/>
       </w:pPr>
       <w:r>
         <w:rPr>
@@ -268,7 +268,7 @@
           <w:ilvl w:val="0"/>
           <w:numId w:val="2"/>
         </w:numPr>
-        <w:spacing w:after="10" w:line="230"/>
+        <w:spacing w:after="5" w:line="230"/>
       </w:pPr>
       <w:r>
         <w:rPr>
@@ -281,7 +281,7 @@
     </w:p>
     <w:p>
       <w:pPr>
-        <w:spacing w:after="0" w:before="40"/>
+        <w:spacing w:after="0" w:before="20"/>
       </w:pPr>
       <w:r>
         <w:rPr>
@@ -313,7 +313,7 @@
           <w:ilvl w:val="0"/>
           <w:numId w:val="2"/>
         </w:numPr>
-        <w:spacing w:after="10" w:line="230"/>
+        <w:spacing w:after="5" w:line="230"/>
       </w:pPr>
       <w:r>
         <w:rPr>
@@ -326,7 +326,7 @@
     </w:p>
     <w:p>
       <w:pPr>
-        <w:spacing w:after="0" w:before="40"/>
+        <w:spacing w:after="0" w:before="20"/>
       </w:pPr>
       <w:r>
         <w:rPr>
@@ -353,7 +353,7 @@
     </w:p>
     <w:p>
       <w:pPr>
-        <w:spacing w:after="0" w:before="40"/>
+        <w:spacing w:after="0" w:before="20"/>
       </w:pPr>
       <w:r>
         <w:rPr>
@@ -385,7 +385,7 @@
           <w:ilvl w:val="0"/>
           <w:numId w:val="2"/>
         </w:numPr>
-        <w:spacing w:after="10" w:line="230"/>
+        <w:spacing w:after="5" w:line="230"/>
       </w:pPr>
       <w:r>
         <w:rPr>
@@ -401,7 +401,7 @@
         <w:pBdr>
           <w:bottom w:val="single" w:color="999999" w:sz="4" w:space="1"/>
         </w:pBdr>
-        <w:spacing w:after="25" w:before="50"/>
+        <w:spacing w:after="12" w:before="25"/>
       </w:pPr>
       <w:r>
         <w:rPr>
@@ -416,7 +416,7 @@
     </w:p>
     <w:p>
       <w:pPr>
-        <w:spacing w:after="0" w:before="40"/>
+        <w:spacing w:after="0" w:before="20"/>
       </w:pPr>
       <w:r>
         <w:rPr>
@@ -443,7 +443,7 @@
     </w:p>
     <w:p>
       <w:pPr>
-        <w:spacing w:after="0" w:before="40"/>
+        <w:spacing w:after="0" w:before="20"/>
       </w:pPr>
       <w:r>
         <w:rPr>
@@ -475,7 +475,7 @@
           <w:ilvl w:val="0"/>
           <w:numId w:val="2"/>
         </w:numPr>
-        <w:spacing w:after="10" w:line="230"/>
+        <w:spacing w:after="5" w:line="230"/>
       </w:pPr>
       <w:r>
         <w:rPr>
@@ -493,7 +493,7 @@
           <w:ilvl w:val="0"/>
           <w:numId w:val="2"/>
         </w:numPr>
-        <w:spacing w:after="10" w:line="230"/>
+        <w:spacing w:after="5" w:line="230"/>
       </w:pPr>
       <w:r>
         <w:rPr>
@@ -511,7 +511,7 @@
           <w:ilvl w:val="0"/>
           <w:numId w:val="2"/>
         </w:numPr>
-        <w:spacing w:after="10" w:line="230"/>
+        <w:spacing w:after="5" w:line="230"/>
       </w:pPr>
       <w:r>
         <w:rPr>
@@ -524,7 +524,7 @@
     </w:p>
     <w:p>
       <w:pPr>
-        <w:spacing w:after="0" w:before="40"/>
+        <w:spacing w:after="0" w:before="20"/>
       </w:pPr>
       <w:r>
         <w:rPr>
@@ -551,7 +551,7 @@
     </w:p>
     <w:p>
       <w:pPr>
-        <w:spacing w:after="0" w:before="40"/>
+        <w:spacing w:after="0" w:before="20"/>
       </w:pPr>
       <w:r>
         <w:rPr>
@@ -583,7 +583,7 @@
           <w:ilvl w:val="0"/>
           <w:numId w:val="2"/>
         </w:numPr>
-        <w:spacing w:after="10" w:line="230"/>
+        <w:spacing w:after="5" w:line="230"/>
       </w:pPr>
       <w:r>
         <w:rPr>
@@ -601,7 +601,7 @@
           <w:ilvl w:val="0"/>
           <w:numId w:val="2"/>
         </w:numPr>
-        <w:spacing w:after="10" w:line="230"/>
+        <w:spacing w:after="5" w:line="230"/>
       </w:pPr>
       <w:r>
         <w:rPr>
@@ -614,7 +614,7 @@
     </w:p>
     <w:p>
       <w:pPr>
-        <w:spacing w:after="0" w:before="40"/>
+        <w:spacing w:after="0" w:before="20"/>
       </w:pPr>
       <w:r>
         <w:rPr>
@@ -641,7 +641,7 @@
     </w:p>
     <w:p>
       <w:pPr>
-        <w:spacing w:after="0" w:before="40"/>
+        <w:spacing w:after="0" w:before="20"/>
       </w:pPr>
       <w:r>
         <w:rPr>
@@ -673,7 +673,7 @@
           <w:ilvl w:val="0"/>
           <w:numId w:val="2"/>
         </w:numPr>
-        <w:spacing w:after="10" w:line="230"/>
+        <w:spacing w:after="5" w:line="230"/>
       </w:pPr>
       <w:r>
         <w:rPr>
@@ -691,7 +691,7 @@
           <w:ilvl w:val="0"/>
           <w:numId w:val="2"/>
         </w:numPr>
-        <w:spacing w:after="10" w:line="230"/>
+        <w:spacing w:after="5" w:line="230"/>
       </w:pPr>
       <w:r>
         <w:rPr>
@@ -709,7 +709,7 @@
           <w:ilvl w:val="0"/>
           <w:numId w:val="2"/>
         </w:numPr>
-        <w:spacing w:after="10" w:line="230"/>
+        <w:spacing w:after="5" w:line="230"/>
       </w:pPr>
       <w:r>
         <w:rPr>
@@ -727,7 +727,7 @@
           <w:ilvl w:val="0"/>
           <w:numId w:val="2"/>
         </w:numPr>
-        <w:spacing w:after="10" w:line="230"/>
+        <w:spacing w:after="5" w:line="230"/>
       </w:pPr>
       <w:r>
         <w:rPr>
@@ -740,7 +740,7 @@
     </w:p>
     <w:p>
       <w:pPr>
-        <w:spacing w:after="0" w:before="40"/>
+        <w:spacing w:after="0" w:before="20"/>
       </w:pPr>
       <w:r>
         <w:rPr>
@@ -767,7 +767,7 @@
     </w:p>
     <w:p>
       <w:pPr>
-        <w:spacing w:after="0" w:before="40"/>
+        <w:spacing w:after="0" w:before="20"/>
       </w:pPr>
       <w:r>
         <w:rPr>
@@ -799,7 +799,7 @@
           <w:ilvl w:val="0"/>
           <w:numId w:val="2"/>
         </w:numPr>
-        <w:spacing w:after="10" w:line="230"/>
+        <w:spacing w:after="5" w:line="230"/>
       </w:pPr>
       <w:r>
         <w:rPr>
@@ -817,7 +817,7 @@
           <w:ilvl w:val="0"/>
           <w:numId w:val="2"/>
         </w:numPr>
-        <w:spacing w:after="10" w:line="230"/>
+        <w:spacing w:after="5" w:line="230"/>
       </w:pPr>
       <w:r>
         <w:rPr>
@@ -833,7 +833,7 @@
         <w:pBdr>
           <w:bottom w:val="single" w:color="999999" w:sz="4" w:space="1"/>
         </w:pBdr>
-        <w:spacing w:after="25" w:before="50"/>
+        <w:spacing w:after="12" w:before="25"/>
       </w:pPr>
       <w:r>
         <w:rPr>
@@ -848,7 +848,7 @@
     </w:p>
     <w:p>
       <w:pPr>
-        <w:spacing w:after="20"/>
+        <w:spacing w:after="10"/>
       </w:pPr>
       <w:r>
         <w:rPr>
@@ -863,7 +863,7 @@
     </w:p>
     <w:p>
       <w:pPr>
-        <w:spacing w:after="20"/>
+        <w:spacing w:after="10"/>
       </w:pPr>
       <w:r>
         <w:rPr>
@@ -878,7 +878,7 @@
     </w:p>
     <w:p>
       <w:pPr>
-        <w:spacing w:after="40"/>
+        <w:spacing w:after="20"/>
       </w:pPr>
       <w:r>
         <w:rPr>
@@ -896,7 +896,7 @@
         <w:pBdr>
           <w:bottom w:val="single" w:color="999999" w:sz="4" w:space="1"/>
         </w:pBdr>
-        <w:spacing w:after="25" w:before="50"/>
+        <w:spacing w:after="12" w:before="25"/>
       </w:pPr>
       <w:r>
         <w:rPr>
@@ -911,7 +911,7 @@
     </w:p>
     <w:p>
       <w:pPr>
-        <w:spacing w:after="40"/>
+        <w:spacing w:after="20"/>
       </w:pPr>
       <w:r>
         <w:rPr>
@@ -921,7 +921,7 @@
           <w:sz w:val="19"/>
           <w:szCs w:val="19"/>
         </w:rPr>
-        <w:t xml:space="preserve">Girl Scout Gold Award &amp; Lifetime Member | Seal of Biliteracy in Spanish | Women of AT&amp;T Scholarship | Project Lead the Way Computer Science Service and Leadership</w:t>
+        <w:t xml:space="preserve">Girl Scout Gold Award &amp; Lifetime Member | Seal of Biliteracy in Spanish | Women of AT&amp;T Scholarship | Project Lead the Way Computer Science Service and Leadership | Ambassador, International Organization of Youth (2026–2027)</w:t>
       </w:r>
     </w:p>
     <w:sectPr>

</xml_diff>